<commit_message>
Cap nhat: them tinh nang activity log, notification, popular items, purchase suggestion, service zone, staff login va cai thien frontend/backend
</commit_message>
<xml_diff>
--- a/word/kế hoạch nâng cấp.docx
+++ b/word/kế hoạch nâng cấp.docx
@@ -202,6 +202,90 @@
           <w:lang w:val="vi-VN"/>
         </w:rPr>
       </w:pPr>
+      <w:r>
+        <w:t>Mai sửa</w:t>
+      </w:r>
+    </w:p>
+    <w:p>
+      <w:pPr>
+        <w:pStyle w:val="ListParagraph"/>
+        <w:numPr>
+          <w:ilvl w:val="0"/>
+          <w:numId w:val="1"/>
+        </w:numPr>
+        <w:rPr>
+          <w:lang w:val="vi-VN"/>
+        </w:rPr>
+      </w:pPr>
+      <w:r>
+        <w:t>ở trang phục vụ thì phải báo khách về rồi mới sang dọn bàn, chứ kh phải khách thanh toán là tự động chuyển sang dọn bàn.</w:t>
+      </w:r>
+    </w:p>
+    <w:p>
+      <w:pPr>
+        <w:pStyle w:val="ListParagraph"/>
+        <w:numPr>
+          <w:ilvl w:val="0"/>
+          <w:numId w:val="1"/>
+        </w:numPr>
+        <w:rPr>
+          <w:lang w:val="vi-VN"/>
+        </w:rPr>
+      </w:pPr>
+      <w:r>
+        <w:t>Thanh toán thì có thể thanh toán tiền mặt nữa nhé, nếu khách đưa 500 mà món ăn ít hơn 500 thì có cả thối tiền nhé, rồi bill sẽ ghi khách đưa bnhiu và tiền bill bao nhiêu thối lại bao nhiêu</w:t>
+      </w:r>
+    </w:p>
+    <w:p>
+      <w:pPr>
+        <w:pStyle w:val="ListParagraph"/>
+        <w:numPr>
+          <w:ilvl w:val="0"/>
+          <w:numId w:val="1"/>
+        </w:numPr>
+        <w:rPr>
+          <w:lang w:val="vi-VN"/>
+        </w:rPr>
+      </w:pPr>
+      <w:r>
+        <w:t xml:space="preserve">Tôi muốn thêm chức năng VAT thuế </w:t>
+      </w:r>
+    </w:p>
+    <w:p>
+      <w:pPr>
+        <w:pStyle w:val="ListParagraph"/>
+        <w:numPr>
+          <w:ilvl w:val="0"/>
+          <w:numId w:val="1"/>
+        </w:numPr>
+        <w:rPr>
+          <w:lang w:val="vi-VN"/>
+        </w:rPr>
+      </w:pPr>
+      <w:r>
+        <w:rPr>
+          <w:lang w:val="vi-VN"/>
+        </w:rPr>
+        <w:t>Phân chia khu vực phục vụ theo từng tầng, từng nhân viên phục vụ, theo các ca...</w:t>
+      </w:r>
+    </w:p>
+    <w:p>
+      <w:pPr>
+        <w:pStyle w:val="ListParagraph"/>
+        <w:numPr>
+          <w:ilvl w:val="0"/>
+          <w:numId w:val="1"/>
+        </w:numPr>
+        <w:rPr>
+          <w:lang w:val="vi-VN"/>
+        </w:rPr>
+      </w:pPr>
+      <w:r>
+        <w:rPr>
+          <w:lang w:val="vi-VN"/>
+        </w:rPr>
+        <w:t>Danh mục gợi ý thức ăn</w:t>
+      </w:r>
     </w:p>
     <w:sectPr>
       <w:pgSz w:w="12240" w:h="15840"/>

</xml_diff>